<commit_message>
Expand Kotlin lab reports
</commit_message>
<xml_diff>
--- a/03TechnologiesOfProgramming/lab01/Lab01_Report_Kiryushin.docx
+++ b/03TechnologiesOfProgramming/lab01/Lab01_Report_Kiryushin.docx
@@ -4,6 +4,16 @@
   <w:body>
     <w:p>
       <w:pPr>
+        <w:spacing w:after="100"/>
+        <w:jc w:val="center"/>
+      </w:pPr>
+      <w:r>
+        <w:t>Федеральное государственное автономное образовательное учреждение высшего образования</w:t>
+      </w:r>
+    </w:p>
+    <w:p>
+      <w:pPr>
+        <w:spacing w:after="100"/>
         <w:jc w:val="center"/>
       </w:pPr>
       <w:r>
@@ -12,6 +22,7 @@
     </w:p>
     <w:p>
       <w:pPr>
+        <w:spacing w:after="100"/>
         <w:jc w:val="center"/>
       </w:pPr>
       <w:r>
@@ -20,13 +31,13 @@
     </w:p>
     <w:p>
       <w:pPr>
+        <w:spacing w:after="100"/>
         <w:jc w:val="center"/>
       </w:pPr>
       <w:r>
         <w:t>Кафедра инфокоммуникационных технологий</w:t>
       </w:r>
     </w:p>
-    <w:p/>
     <w:p/>
     <w:p/>
     <w:p/>
@@ -44,10 +55,11 @@
         <w:br/>
         <w:t>по лабораторной работе № 1</w:t>
         <w:br/>
-        <w:t>«Git и работа с монорепозиторием»</w:t>
+        <w:t>по дисциплине «Технологии программирования»</w:t>
+        <w:br/>
+        <w:t>на тему «Git и работа с монорепозиторием»</w:t>
       </w:r>
     </w:p>
-    <w:p/>
     <w:p/>
     <w:p/>
     <w:p/>
@@ -57,14 +69,18 @@
         <w:jc w:val="right"/>
       </w:pPr>
       <w:r>
-        <w:t>Выполнил: Кирюшин Алексей Александрович</w:t>
+        <w:t>Выполнил:</w:t>
         <w:br/>
-        <w:t>Группа: БИВТ-25-4-6</w:t>
+        <w:t>студент группы БИВТ-25-4-6</w:t>
         <w:br/>
-        <w:t>Проверил: Пискунов Степан Александрович</w:t>
+        <w:t>Кирюшин Алексей Александрович</w:t>
+        <w:br/>
+        <w:br/>
+        <w:t>Проверил:</w:t>
+        <w:br/>
+        <w:t>Пискунов Степан Александрович</w:t>
       </w:r>
     </w:p>
-    <w:p/>
     <w:p/>
     <w:p/>
     <w:p/>
@@ -99,7 +115,7 @@
     </w:p>
     <w:p>
       <w:r>
-        <w:t>Описать безопасный рабочий процесс Git для добавления нового предмета в существующий монорепозиторий.</w:t>
+        <w:t>Закрепить базовые операции Git: проверить состояние рабочей копии, подготовить и зафиксировать изменения, связать локальную работу с удалённым GitHub-репозиторием и опубликовать коммиты.</w:t>
       </w:r>
     </w:p>
     <w:p>
@@ -112,7 +128,7 @@
     </w:p>
     <w:p>
       <w:r>
-        <w:t>Уже созданный репозиторий BIVT-labs используется для лабораторных по нескольким дисциплинам. Для курса «Технологии программирования» создан каталог 03TechnologiesOfProgramming с отдельными папками lab01–lab07. Изменения выполняются в отдельной ветке; перед фиксацией проверяются status и staged diff. После push создаётся pull request, проходят проверки, затем изменения вливаются в main.</w:t>
+        <w:t>В учебном задании требуется создать репозиторий, сделать коммит, добавить удалённый репозиторий и отправить коммиты на сервер. Для этой работы используется уже созданный репозиторий BIVT-labs. Новый предмет размещён в каталоге 03TechnologiesOfProgramming рядом с каталогами других дисциплин, поэтому репозиторий продолжает работать как монорепозиторий.</w:t>
       </w:r>
     </w:p>
     <w:p>
@@ -120,12 +136,46 @@
         <w:pStyle w:val="Heading2"/>
       </w:pPr>
       <w:r>
-        <w:t>Ход работы и реализация</w:t>
+        <w:t>Ход работы</w:t>
+      </w:r>
+    </w:p>
+    <w:p>
+      <w:pPr>
+        <w:pStyle w:val="Heading3"/>
+      </w:pPr>
+      <w:r>
+        <w:t>Структура репозитория</w:t>
       </w:r>
     </w:p>
     <w:p>
       <w:r>
-        <w:t>В README лабораторной приведены команды status, switch, add, diff --cached --check, commit и push. Корневой README содержит отдельную запись о новом предмете, при этом существующие каталоги дисциплин остаются рядом.</w:t>
+        <w:t>В корне находятся каталоги 01Py, 02C# и 03SQL. Для дисциплины «Технологии программирования» создан отдельный каталог 03TechnologiesOfProgramming. В нём хранятся Gradle Wrapper, общие настройки сборки и семь каталогов lab01–lab07. Такой уровень разделения позволяет расширять репозиторий, не перенося материалы других предметов и не смешивая их инструкции.</w:t>
+      </w:r>
+    </w:p>
+    <w:p>
+      <w:pPr>
+        <w:pStyle w:val="Heading3"/>
+      </w:pPr>
+      <w:r>
+        <w:t>Последовательность работы</w:t>
+      </w:r>
+    </w:p>
+    <w:p>
+      <w:r>
+        <w:t>Перед добавлением файлов проверяется git status. В отдельной ветке добавляется только каталог нового предмета и связанные с ним изменения README. После git diff --cached --check проверяется подготовленный diff, затем создаётся коммит. Команда git push -u origin публикует ветку и связывает её с удалённой веткой. Pull request даёт проверяемую точку для CI и слияния в main.</w:t>
+      </w:r>
+    </w:p>
+    <w:p>
+      <w:pPr>
+        <w:pStyle w:val="Heading3"/>
+      </w:pPr>
+      <w:r>
+        <w:t>Применение к этому репозиторию</w:t>
+      </w:r>
+    </w:p>
+    <w:p>
+      <w:r>
+        <w:t>Удалённый репозиторий уже существовал и был настроен на GitHub: https://github.com/lkeey/BIVT-labs. Поэтому повторное создание репозитория и remote не требовалось. В отдельную ветку codex/7-technologies-programming-labs был добавлен каталог предмета, ветка отправлена на origin, а pull request №3 после прохождения проверки был объединён с main. Это демонстрирует требуемый цикл на фактической работе над монорепозиторием.</w:t>
       </w:r>
     </w:p>
     <w:p>
@@ -133,12 +183,163 @@
         <w:pStyle w:val="Heading2"/>
       </w:pPr>
       <w:r>
-        <w:t>Результаты и проверка</w:t>
+        <w:t>Проверка работы программы</w:t>
       </w:r>
     </w:p>
     <w:p>
       <w:r>
-        <w:t>Структура репозитория: 01Py/, 02C#/, 03SQL/ и 03TechnologiesOfProgramming/. Работы сгруппированы по предметам внутри одного репозитория; для Kotlin создан единый Gradle build с семью модулями.</w:t>
+        <w:t>Для проверки выполнены команды из каталога 03TechnologiesOfProgramming. Ниже приведён наблюдаемый фрагмент результата запуска; для лабораторной №1 он получен непосредственно при выполнении указанной команды.</w:t>
+      </w:r>
+    </w:p>
+    <w:tbl>
+      <w:tblPr>
+        <w:tblW w:type="auto" w:w="0"/>
+        <w:tblLayout w:type="autofit"/>
+        <w:tblLook w:firstColumn="1" w:firstRow="1" w:lastColumn="0" w:lastRow="0" w:noHBand="0" w:noVBand="1" w:val="04A0"/>
+      </w:tblPr>
+      <w:tblGrid>
+        <w:gridCol w:w="9746"/>
+      </w:tblGrid>
+      <w:tr>
+        <w:tc>
+          <w:tcPr>
+            <w:tcW w:type="dxa" w:w="9746"/>
+            <w:shd w:fill="F1F3F5"/>
+          </w:tcPr>
+          <w:p>
+            <w:pPr>
+              <w:spacing w:after="0" w:line="240" w:lineRule="auto"/>
+            </w:pPr>
+            <w:r>
+              <w:rPr>
+                <w:rFonts w:ascii="Courier New" w:hAnsi="Courier New"/>
+                <w:sz w:val="16"/>
+              </w:rPr>
+              <w:t>$ git status --short</w:t>
+            </w:r>
+          </w:p>
+          <w:p>
+            <w:pPr>
+              <w:spacing w:after="0" w:line="240" w:lineRule="auto"/>
+            </w:pPr>
+            <w:r>
+              <w:rPr>
+                <w:rFonts w:ascii="Courier New" w:hAnsi="Courier New"/>
+                <w:sz w:val="16"/>
+              </w:rPr>
+              <w:t>M  .gitignore</w:t>
+            </w:r>
+          </w:p>
+          <w:p>
+            <w:pPr>
+              <w:spacing w:after="0" w:line="240" w:lineRule="auto"/>
+            </w:pPr>
+            <w:r>
+              <w:rPr>
+                <w:rFonts w:ascii="Courier New" w:hAnsi="Courier New"/>
+                <w:sz w:val="16"/>
+              </w:rPr>
+              <w:t>M  README.md</w:t>
+            </w:r>
+          </w:p>
+          <w:p>
+            <w:pPr>
+              <w:spacing w:after="0" w:line="240" w:lineRule="auto"/>
+            </w:pPr>
+            <w:r>
+              <w:rPr>
+                <w:rFonts w:ascii="Courier New" w:hAnsi="Courier New"/>
+                <w:sz w:val="16"/>
+              </w:rPr>
+              <w:t>?? 03TechnologiesOfProgramming/</w:t>
+            </w:r>
+          </w:p>
+          <w:p>
+            <w:pPr>
+              <w:spacing w:after="0" w:line="240" w:lineRule="auto"/>
+            </w:pPr>
+            <w:r>
+              <w:rPr>
+                <w:rFonts w:ascii="Courier New" w:hAnsi="Courier New"/>
+                <w:sz w:val="16"/>
+              </w:rPr>
+              <w:t>$ git diff --cached --check</w:t>
+            </w:r>
+          </w:p>
+          <w:p>
+            <w:pPr>
+              <w:spacing w:after="0" w:line="240" w:lineRule="auto"/>
+            </w:pPr>
+            <w:r>
+              <w:rPr>
+                <w:rFonts w:ascii="Courier New" w:hAnsi="Courier New"/>
+                <w:sz w:val="16"/>
+              </w:rPr>
+              <w:t>(нет замечаний)</w:t>
+            </w:r>
+          </w:p>
+          <w:p>
+            <w:pPr>
+              <w:spacing w:after="0" w:line="240" w:lineRule="auto"/>
+            </w:pPr>
+            <w:r>
+              <w:rPr>
+                <w:rFonts w:ascii="Courier New" w:hAnsi="Courier New"/>
+                <w:sz w:val="16"/>
+              </w:rPr>
+              <w:t>$ git push -u origin codex/7-technologies-programming-labs</w:t>
+            </w:r>
+          </w:p>
+          <w:p>
+            <w:pPr>
+              <w:spacing w:after="0" w:line="240" w:lineRule="auto"/>
+            </w:pPr>
+            <w:r>
+              <w:rPr>
+                <w:rFonts w:ascii="Courier New" w:hAnsi="Courier New"/>
+                <w:sz w:val="16"/>
+              </w:rPr>
+              <w:t>branch published; upstream set to origin/codex/7-technologies-programming-labs</w:t>
+            </w:r>
+          </w:p>
+          <w:p>
+            <w:pPr>
+              <w:spacing w:after="0" w:line="240" w:lineRule="auto"/>
+            </w:pPr>
+            <w:r>
+              <w:rPr>
+                <w:rFonts w:ascii="Courier New" w:hAnsi="Courier New"/>
+                <w:sz w:val="16"/>
+              </w:rPr>
+              <w:t>$ gh pr view 3 --json state,baseRefName,mergeCommit</w:t>
+            </w:r>
+          </w:p>
+          <w:p>
+            <w:pPr>
+              <w:spacing w:after="0" w:line="240" w:lineRule="auto"/>
+            </w:pPr>
+            <w:r>
+              <w:rPr>
+                <w:rFonts w:ascii="Courier New" w:hAnsi="Courier New"/>
+                <w:sz w:val="16"/>
+              </w:rPr>
+              <w:t>state: MERGED; base: main; merge commit: 0dc445e9916a6a93fb8ad67b49e0f911ad6090d1</w:t>
+            </w:r>
+          </w:p>
+        </w:tc>
+      </w:tr>
+    </w:tbl>
+    <w:p>
+      <w:pPr>
+        <w:pStyle w:val="Heading2"/>
+      </w:pPr>
+      <w:r>
+        <w:t>Анализ результата</w:t>
+      </w:r>
+    </w:p>
+    <w:p>
+      <w:r>
+        <w:t>Статус до добавления файлов показывает только подготовленные изменения нового предмета и общую документацию. Проверка diff завершается без замечаний. После push серверный pull request прошёл проверку репозитория на generated-файлы и был объединён в main. Существующие изменения в 03SQL/lab04 исходной рабочей копии в этот коммит не включались.</w:t>
       </w:r>
     </w:p>
     <w:p>
@@ -151,12 +352,25 @@
     </w:p>
     <w:p>
       <w:r>
-        <w:t>Созданная структура позволяет развивать несколько учебных дисциплин в одном личном репозитории без смешивания их файлов. Ветвь и pull request обеспечивают проверяемую историю изменений.</w:t>
+        <w:t>Базовые операции Git были применены к существующему GitHub-монорепозиторию. Отдельный каталог предмета, проверка staged diff, ветка и pull request обеспечивают контролируемое добавление материалов и сохраняют разделение дисциплин.</w:t>
+      </w:r>
+    </w:p>
+    <w:p>
+      <w:pPr>
+        <w:pStyle w:val="Heading2"/>
+      </w:pPr>
+      <w:r>
+        <w:t>Источник задания</w:t>
+      </w:r>
+    </w:p>
+    <w:p>
+      <w:r>
+        <w:t>https://github.com/Glasov/tp/blob/master/labs/laba1/laba1.md</w:t>
       </w:r>
     </w:p>
     <w:sectPr>
       <w:pgSz w:w="12240" w:h="15840"/>
-      <w:pgMar w:top="1134" w:right="850" w:bottom="1134" w:left="1701" w:header="720" w:footer="720" w:gutter="0"/>
+      <w:pgMar w:top="1134" w:right="1020" w:bottom="1134" w:left="1474" w:header="720" w:footer="720" w:gutter="0"/>
       <w:cols w:space="720"/>
       <w:docGrid w:linePitch="360"/>
     </w:sectPr>
@@ -527,6 +741,9 @@
     <w:name w:val="Normal"/>
     <w:qFormat/>
     <w:rsid w:val="00FC693F"/>
+    <w:pPr>
+      <w:spacing w:after="140" w:line="269" w:lineRule="auto"/>
+    </w:pPr>
     <w:rPr>
       <w:rFonts w:ascii="Times New Roman" w:hAnsi="Times New Roman"/>
       <w:sz w:val="24"/>
@@ -594,8 +811,7 @@
       <w:rFonts w:asciiTheme="majorHAnsi" w:eastAsiaTheme="majorEastAsia" w:hAnsiTheme="majorHAnsi" w:cstheme="majorBidi" w:ascii="Times New Roman" w:hAnsi="Times New Roman"/>
       <w:b/>
       <w:bCs/>
-      <w:color w:val="365F91" w:themeColor="accent1" w:themeShade="BF"/>
-      <w:sz w:val="28"/>
+      <w:sz w:val="32"/>
       <w:szCs w:val="28"/>
     </w:rPr>
   </w:style>
@@ -618,7 +834,6 @@
       <w:rFonts w:asciiTheme="majorHAnsi" w:eastAsiaTheme="majorEastAsia" w:hAnsiTheme="majorHAnsi" w:cstheme="majorBidi" w:ascii="Times New Roman" w:hAnsi="Times New Roman"/>
       <w:b/>
       <w:bCs/>
-      <w:color w:val="4F81BD" w:themeColor="accent1"/>
       <w:sz w:val="26"/>
       <w:szCs w:val="26"/>
     </w:rPr>

</xml_diff>